<commit_message>
fix(validation): app-side length limits, safe admin prices, docs
- PillTextField takes maxLength (no counter); every login, register,
  password, profile and address field stops at the server's limit.
- Admin product, category, search and reply fields are limited too;
  price fields take only digits and a dot, and a typed price is sent
  as a number only when it is finite (fixes "nan").
- Requirement Analysis: API-03 type/length checks, NFR-08 attempt
  limits, NFR-08b sign-out after a password change, NFR-10 conditional
  stock update, BR-05 new order number format; use case UC-13 updated.
  Word and PDF copies rebuilt.
- 2 new widget tests (179 in total).

Co-Authored-By: Claude Opus 5.5 <noreply@anthropic.com>
Claude-Session: https://claude.ai/code/session_01NZHPyp1BcAyBymo1vC6nPu
</commit_message>
<xml_diff>
--- a/docs/requirements/REQUIREMENTS.docx
+++ b/docs/requirements/REQUIREMENTS.docx
@@ -7491,7 +7491,7 @@
               <w:rPr>
                 <w:sz w:val="19"/>
               </w:rPr>
-              <w:t xml:space="preserve">happens on the server for every input; a</w:t>
+              <w:t xml:space="preserve">happens on the server for every input: types (text, whole numbers, true/false), lengths that fit the database columns, ranges and allowed values. A</w:t>
             </w:r>
             <w:r>
               <w:rPr>
@@ -7535,7 +7535,7 @@
               <w:rPr>
                 <w:sz w:val="19"/>
               </w:rPr>
-              <w:t xml:space="preserve">.</w:t>
+              <w:t xml:space="preserve">; a wrong value never causes a server error.</w:t>
             </w:r>
           </w:p>
         </w:tc>
@@ -8698,23 +8698,42 @@
               <w:rPr>
                 <w:sz w:val="19"/>
               </w:rPr>
-              <w:t xml:space="preserve">Password reset cannot be brute-forced.</w:t>
-            </w:r>
-          </w:p>
-        </w:tc>
-        <w:tc>
-          <w:tcPr/>
-          <w:p>
-            <w:pPr>
-              <w:pStyle w:val="Compact"/>
-              <w:spacing w:after="40"/>
-              <w:jc w:val="left"/>
-            </w:pPr>
-            <w:r>
-              <w:rPr>
-                <w:sz w:val="19"/>
-              </w:rPr>
-              <w:t xml:space="preserve">Code valid 10 minutes, locked after 5 wrong tries, 60 s between requests, max 5 requests per hour</w:t>
+              <w:t xml:space="preserve">Passwords and reset codes cannot be brute-forced, and the shop cannot be flooded.</w:t>
+            </w:r>
+          </w:p>
+        </w:tc>
+        <w:tc>
+          <w:tcPr/>
+          <w:p>
+            <w:pPr>
+              <w:pStyle w:val="Compact"/>
+              <w:spacing w:after="40"/>
+              <w:jc w:val="left"/>
+            </w:pPr>
+            <w:r>
+              <w:rPr>
+                <w:sz w:val="19"/>
+              </w:rPr>
+              <w:t xml:space="preserve">Login: 10 tries a minute per network and 10 per 15 minutes per email; sign-up: 20 an hour per network; contact: 5 messages in 10 minutes and 30 a day per account (Flask-Limiter,</w:t>
+            </w:r>
+            <w:r>
+              <w:rPr>
+                <w:sz w:val="19"/>
+              </w:rPr>
+              <w:t xml:space="preserve"> </w:t>
+            </w:r>
+            <w:r>
+              <w:rPr>
+                <w:rStyle w:val="VerbatimChar"/>
+                <w:sz w:val="19"/>
+              </w:rPr>
+              <w:t xml:space="preserve">429</w:t>
+            </w:r>
+            <w:r>
+              <w:rPr>
+                <w:sz w:val="19"/>
+              </w:rPr>
+              <w:t xml:space="preserve">). Reset code valid 10 minutes, locked after 5 wrong tries, 60 s between requests, max 5 requests per hour</w:t>
             </w:r>
           </w:p>
         </w:tc>
@@ -8734,7 +8753,7 @@
               <w:rPr>
                 <w:sz w:val="19"/>
               </w:rPr>
-              <w:t xml:space="preserve">NFR-09</w:t>
+              <w:t xml:space="preserve">NFR-08b</w:t>
             </w:r>
           </w:p>
         </w:tc>
@@ -8766,36 +8785,36 @@
               <w:rPr>
                 <w:sz w:val="19"/>
               </w:rPr>
-              <w:t xml:space="preserve">Secrets are not in the source code.</w:t>
-            </w:r>
-          </w:p>
-        </w:tc>
-        <w:tc>
-          <w:tcPr/>
-          <w:p>
-            <w:pPr>
-              <w:pStyle w:val="Compact"/>
-              <w:spacing w:after="40"/>
-              <w:jc w:val="left"/>
-            </w:pPr>
+              <w:t xml:space="preserve">Changing or resetting the password signs out the account's other devices.</w:t>
+            </w:r>
+          </w:p>
+        </w:tc>
+        <w:tc>
+          <w:tcPr/>
+          <w:p>
+            <w:pPr>
+              <w:pStyle w:val="Compact"/>
+              <w:spacing w:after="40"/>
+              <w:jc w:val="left"/>
+            </w:pPr>
+            <w:r>
+              <w:rPr>
+                <w:sz w:val="19"/>
+              </w:rPr>
+              <w:t xml:space="preserve">A token version in each login token; older tokens get</w:t>
+            </w:r>
+            <w:r>
+              <w:rPr>
+                <w:sz w:val="19"/>
+              </w:rPr>
+              <w:t xml:space="preserve"> </w:t>
+            </w:r>
             <w:r>
               <w:rPr>
                 <w:rStyle w:val="VerbatimChar"/>
                 <w:sz w:val="19"/>
               </w:rPr>
-              <w:t xml:space="preserve">.env</w:t>
-            </w:r>
-            <w:r>
-              <w:rPr>
-                <w:sz w:val="19"/>
-              </w:rPr>
-              <w:t xml:space="preserve"> </w:t>
-            </w:r>
-            <w:r>
-              <w:rPr>
-                <w:sz w:val="19"/>
-              </w:rPr>
-              <w:t xml:space="preserve">file (git-ignored) for database URL, secret keys and Bakong token</w:t>
+              <w:t xml:space="preserve">401</w:t>
             </w:r>
           </w:p>
         </w:tc>
@@ -8815,6 +8834,87 @@
               <w:rPr>
                 <w:sz w:val="19"/>
               </w:rPr>
+              <w:t xml:space="preserve">NFR-09</w:t>
+            </w:r>
+          </w:p>
+        </w:tc>
+        <w:tc>
+          <w:tcPr/>
+          <w:p>
+            <w:pPr>
+              <w:pStyle w:val="Compact"/>
+              <w:spacing w:after="40"/>
+              <w:jc w:val="left"/>
+            </w:pPr>
+            <w:r>
+              <w:rPr>
+                <w:sz w:val="19"/>
+              </w:rPr>
+              <w:t xml:space="preserve">Security</w:t>
+            </w:r>
+          </w:p>
+        </w:tc>
+        <w:tc>
+          <w:tcPr/>
+          <w:p>
+            <w:pPr>
+              <w:pStyle w:val="Compact"/>
+              <w:spacing w:after="40"/>
+              <w:jc w:val="left"/>
+            </w:pPr>
+            <w:r>
+              <w:rPr>
+                <w:sz w:val="19"/>
+              </w:rPr>
+              <w:t xml:space="preserve">Secrets are not in the source code.</w:t>
+            </w:r>
+          </w:p>
+        </w:tc>
+        <w:tc>
+          <w:tcPr/>
+          <w:p>
+            <w:pPr>
+              <w:pStyle w:val="Compact"/>
+              <w:spacing w:after="40"/>
+              <w:jc w:val="left"/>
+            </w:pPr>
+            <w:r>
+              <w:rPr>
+                <w:rStyle w:val="VerbatimChar"/>
+                <w:sz w:val="19"/>
+              </w:rPr>
+              <w:t xml:space="preserve">.env</w:t>
+            </w:r>
+            <w:r>
+              <w:rPr>
+                <w:sz w:val="19"/>
+              </w:rPr>
+              <w:t xml:space="preserve"> </w:t>
+            </w:r>
+            <w:r>
+              <w:rPr>
+                <w:sz w:val="19"/>
+              </w:rPr>
+              <w:t xml:space="preserve">file (git-ignored) for database URL, secret keys and Bakong token</w:t>
+            </w:r>
+          </w:p>
+        </w:tc>
+      </w:tr>
+      <w:tr>
+        <w:tc>
+          <w:tcPr>
+            <w:noWrap/>
+          </w:tcPr>
+          <w:p>
+            <w:pPr>
+              <w:pStyle w:val="Compact"/>
+              <w:spacing w:after="40"/>
+              <w:jc w:val="left"/>
+            </w:pPr>
+            <w:r>
+              <w:rPr>
+                <w:sz w:val="19"/>
+              </w:rPr>
               <w:t xml:space="preserve">NFR-10</w:t>
             </w:r>
           </w:p>
@@ -8847,23 +8947,61 @@
               <w:rPr>
                 <w:sz w:val="19"/>
               </w:rPr>
-              <w:t xml:space="preserve">Stock can never go below zero and an order is all-or-nothing.</w:t>
-            </w:r>
-          </w:p>
-        </w:tc>
-        <w:tc>
-          <w:tcPr/>
-          <w:p>
-            <w:pPr>
-              <w:pStyle w:val="Compact"/>
-              <w:spacing w:after="40"/>
-              <w:jc w:val="left"/>
-            </w:pPr>
-            <w:r>
-              <w:rPr>
-                <w:sz w:val="19"/>
-              </w:rPr>
-              <w:t xml:space="preserve">Stock re-checked when the order is placed, in one database transaction</w:t>
+              <w:t xml:space="preserve">Stock can never go below zero, even when two customers buy the last item at the same moment, and an order is all-or-nothing.</w:t>
+            </w:r>
+          </w:p>
+        </w:tc>
+        <w:tc>
+          <w:tcPr/>
+          <w:p>
+            <w:pPr>
+              <w:pStyle w:val="Compact"/>
+              <w:spacing w:after="40"/>
+              <w:jc w:val="left"/>
+            </w:pPr>
+            <w:r>
+              <w:rPr>
+                <w:sz w:val="19"/>
+              </w:rPr>
+              <w:t xml:space="preserve">Each item's stock is taken with one conditional</w:t>
+            </w:r>
+            <w:r>
+              <w:rPr>
+                <w:sz w:val="19"/>
+              </w:rPr>
+              <w:t xml:space="preserve"> </w:t>
+            </w:r>
+            <w:r>
+              <w:rPr>
+                <w:rStyle w:val="VerbatimChar"/>
+                <w:sz w:val="19"/>
+              </w:rPr>
+              <w:t xml:space="preserve">UPDATE ... WHERE stock &gt;= quantity</w:t>
+            </w:r>
+            <w:r>
+              <w:rPr>
+                <w:sz w:val="19"/>
+              </w:rPr>
+              <w:t xml:space="preserve"> </w:t>
+            </w:r>
+            <w:r>
+              <w:rPr>
+                <w:sz w:val="19"/>
+              </w:rPr>
+              <w:t xml:space="preserve">inside the order's transaction; if it no longer matches, the whole order is rolled back with</w:t>
+            </w:r>
+            <w:r>
+              <w:rPr>
+                <w:sz w:val="19"/>
+              </w:rPr>
+              <w:t xml:space="preserve"> </w:t>
+            </w:r>
+            <w:r>
+              <w:rPr>
+                <w:rStyle w:val="VerbatimChar"/>
+                <w:sz w:val="19"/>
+              </w:rPr>
+              <w:t xml:space="preserve">409</w:t>
             </w:r>
           </w:p>
         </w:tc>
@@ -9460,13 +9598,13 @@
                 <w:rStyle w:val="VerbatimChar"/>
                 <w:sz w:val="19"/>
               </w:rPr>
-              <w:t xml:space="preserve">AWS-20261016-0001</w:t>
-            </w:r>
-            <w:r>
-              <w:rPr>
-                <w:sz w:val="19"/>
-              </w:rPr>
-              <w:t xml:space="preserve">.</w:t>
+              <w:t xml:space="preserve">AWS-20261016-00042</w:t>
+            </w:r>
+            <w:r>
+              <w:rPr>
+                <w:sz w:val="19"/>
+              </w:rPr>
+              <w:t xml:space="preserve">: the date plus the order's own id, so two orders placed at the same moment never share a number.</w:t>
             </w:r>
           </w:p>
         </w:tc>

</xml_diff>

<commit_message>
fix(khqr): real Bakong payments only; remove demo shortcuts
- A paid KHQR stayed on the QR screen: PAYMENT_PROVIDER was still "mock",
  so the server never asked Bakong. Mock mode is gone: every pending
  payment is checked on Bakong (old "mock" rows too, since their QR paid
  the real account), and Bakong is asked before the 15-minute expiry so
  money paid at the last second still counts.
- Removed POST /orders/<id>/payment/simulate, the "demo" flag and the
  "Simulate payment (demo)" button.
- Removed the "Use demo account" button on Login.
- Tests use a fake Bakong (conftest `bank` fixture) instead of the real
  token. API docs, requirements and use cases updated.

Co-Authored-By: Claude Opus 5.5 <noreply@anthropic.com>
Claude-Session: https://claude.ai/code/session_01NZHPyp1BcAyBymo1vC6nPu
</commit_message>
<xml_diff>
--- a/docs/requirements/REQUIREMENTS.docx
+++ b/docs/requirements/REQUIREMENTS.docx
@@ -16539,38 +16539,25 @@
         <w:pStyle w:val="Compact"/>
       </w:pPr>
       <w:r>
-        <w:t xml:space="preserve">KHQR runs in</w:t>
-      </w:r>
-      <w:r>
-        <w:t xml:space="preserve"> </w:t>
-      </w:r>
-      <w:r>
-        <w:rPr>
-          <w:bCs/>
-          <w:b/>
-        </w:rPr>
-        <w:t xml:space="preserve">mock</w:t>
-      </w:r>
-      <w:r>
-        <w:t xml:space="preserve"> </w:t>
-      </w:r>
-      <w:r>
-        <w:t xml:space="preserve">mode for the demo (a demo QR and a "Simulate payment" button); setting</w:t>
-      </w:r>
-      <w:r>
-        <w:t xml:space="preserve"> </w:t>
+        <w:t xml:space="preserve">KHQR takes real payments through Bakong: the server needs a Bakong Open API token (</w:t>
       </w:r>
       <w:r>
         <w:rPr>
           <w:rStyle w:val="VerbatimChar"/>
         </w:rPr>
-        <w:t xml:space="preserve">PAYMENT_PROVIDER=bakong</w:t>
+        <w:t xml:space="preserve">BAKONG_TOKEN</w:t>
       </w:r>
       <w:r>
-        <w:t xml:space="preserve"> </w:t>
+        <w:t xml:space="preserve">, renewed about every 90 days) and the receiving account (</w:t>
       </w:r>
       <w:r>
-        <w:t xml:space="preserve">with a Bakong token makes it take real payments.</w:t>
+        <w:rPr>
+          <w:rStyle w:val="VerbatimChar"/>
+        </w:rPr>
+        <w:t xml:space="preserve">BAKONG_ACCOUNT_ID</w:t>
+      </w:r>
+      <w:r>
+        <w:t xml:space="preserve">).</w:t>
       </w:r>
     </w:p>
     <w:p>

</xml_diff>

<commit_message>
feat(staff): staff role and owner-only staff management (layout A)
- Roles customer | staff | admin; staff run orders, products, categories,
  messages, reviews and view customers; promo codes, blocking customers and
  staff accounts stay with the owner (admin)
- /api/admin/staff list, add, change role, reset password, disable; you can't
  demote or disable yourself and the last active admin is kept
- users.last_login_at; role enum widened by init-db
- Web admin Staff page (table + drawer) and mobile More > Staff
- Docs: requirements, use cases, diagrams, ERD, schema, API docs, README

Co-Authored-By: Claude Opus 5.5 <noreply@anthropic.com>
Claude-Session: https://claude.ai/code/session_01NZHPyp1BcAyBymo1vC6nPu
</commit_message>
<xml_diff>
--- a/docs/requirements/REQUIREMENTS.docx
+++ b/docs/requirements/REQUIREMENTS.docx
@@ -370,7 +370,7 @@
               <w:rPr>
                 <w:sz w:val="19"/>
               </w:rPr>
-              <w:t xml:space="preserve">Shop owner and staff (same app, opened by an admin account)</w:t>
+              <w:t xml:space="preserve">Shop owner and staff (same app, opened by an admin or staff account)</w:t>
             </w:r>
           </w:p>
         </w:tc>
@@ -1037,23 +1037,75 @@
                 <w:b/>
                 <w:sz w:val="19"/>
               </w:rPr>
-              <w:t xml:space="preserve">Admin (shop owner / staff)</w:t>
-            </w:r>
-          </w:p>
-        </w:tc>
-        <w:tc>
-          <w:tcPr/>
-          <w:p>
-            <w:pPr>
-              <w:pStyle w:val="Compact"/>
-              <w:spacing w:after="40"/>
-              <w:jc w:val="left"/>
-            </w:pPr>
-            <w:r>
-              <w:rPr>
-                <w:sz w:val="19"/>
-              </w:rPr>
-              <w:t xml:space="preserve">Runs the shop</w:t>
+              <w:t xml:space="preserve">Admin (shop owner)</w:t>
+            </w:r>
+          </w:p>
+        </w:tc>
+        <w:tc>
+          <w:tcPr/>
+          <w:p>
+            <w:pPr>
+              <w:pStyle w:val="Compact"/>
+              <w:spacing w:after="40"/>
+              <w:jc w:val="left"/>
+            </w:pPr>
+            <w:r>
+              <w:rPr>
+                <w:sz w:val="19"/>
+              </w:rPr>
+              <w:t xml:space="preserve">Owns the shop</w:t>
+            </w:r>
+          </w:p>
+        </w:tc>
+        <w:tc>
+          <w:tcPr/>
+          <w:p>
+            <w:pPr>
+              <w:pStyle w:val="Compact"/>
+              <w:spacing w:after="40"/>
+              <w:jc w:val="left"/>
+            </w:pPr>
+            <w:r>
+              <w:rPr>
+                <w:sz w:val="19"/>
+              </w:rPr>
+              <w:t xml:space="preserve">Everything staff do, plus manage staff accounts, promo codes and blocked customers</w:t>
+            </w:r>
+          </w:p>
+        </w:tc>
+      </w:tr>
+      <w:tr>
+        <w:tc>
+          <w:tcPr/>
+          <w:p>
+            <w:pPr>
+              <w:pStyle w:val="Compact"/>
+              <w:spacing w:after="40"/>
+              <w:jc w:val="left"/>
+            </w:pPr>
+            <w:r>
+              <w:rPr>
+                <w:bCs/>
+                <w:b/>
+                <w:sz w:val="19"/>
+              </w:rPr>
+              <w:t xml:space="preserve">Staff</w:t>
+            </w:r>
+          </w:p>
+        </w:tc>
+        <w:tc>
+          <w:tcPr/>
+          <w:p>
+            <w:pPr>
+              <w:pStyle w:val="Compact"/>
+              <w:spacing w:after="40"/>
+              <w:jc w:val="left"/>
+            </w:pPr>
+            <w:r>
+              <w:rPr>
+                <w:sz w:val="19"/>
+              </w:rPr>
+              <w:t xml:space="preserve">Runs the shop day to day</w:t>
             </w:r>
           </w:p>
         </w:tc>
@@ -2566,7 +2618,7 @@
               <w:rPr>
                 <w:sz w:val="19"/>
               </w:rPr>
-              <w:t xml:space="preserve">with the logo while it checks for a saved login, then opens the shop (customer), the admin area (admin) or the login screen.</w:t>
+              <w:t xml:space="preserve">with the logo while it checks for a saved login, then opens the shop (customer), the admin area (admin or staff) or the login screen.</w:t>
             </w:r>
           </w:p>
         </w:tc>
@@ -3250,7 +3302,7 @@
               <w:rPr>
                 <w:sz w:val="19"/>
               </w:rPr>
-              <w:t xml:space="preserve">(customer or admin); admin-only screens and API calls are refused for customers.</w:t>
+              <w:t xml:space="preserve">(customer, staff or admin); shop screens and API calls are refused for customers, and owner-only ones (staff, promo codes, blocking customers) for staff.</w:t>
             </w:r>
           </w:p>
         </w:tc>
@@ -7012,6 +7064,162 @@
                 <w:sz w:val="19"/>
               </w:rPr>
               <w:t xml:space="preserve">C</w:t>
+            </w:r>
+          </w:p>
+        </w:tc>
+      </w:tr>
+      <w:tr>
+        <w:tc>
+          <w:tcPr>
+            <w:noWrap/>
+          </w:tcPr>
+          <w:p>
+            <w:pPr>
+              <w:pStyle w:val="Compact"/>
+              <w:spacing w:after="40"/>
+              <w:jc w:val="left"/>
+            </w:pPr>
+            <w:r>
+              <w:rPr>
+                <w:sz w:val="19"/>
+              </w:rPr>
+              <w:t xml:space="preserve">FR-AD10</w:t>
+            </w:r>
+          </w:p>
+        </w:tc>
+        <w:tc>
+          <w:tcPr/>
+          <w:p>
+            <w:pPr>
+              <w:pStyle w:val="Compact"/>
+              <w:spacing w:after="40"/>
+              <w:jc w:val="left"/>
+            </w:pPr>
+            <w:r>
+              <w:rPr>
+                <w:sz w:val="19"/>
+              </w:rPr>
+              <w:t xml:space="preserve">The admin (owner) can</w:t>
+            </w:r>
+            <w:r>
+              <w:rPr>
+                <w:sz w:val="19"/>
+              </w:rPr>
+              <w:t xml:space="preserve"> </w:t>
+            </w:r>
+            <w:r>
+              <w:rPr>
+                <w:bCs/>
+                <w:b/>
+                <w:sz w:val="19"/>
+              </w:rPr>
+              <w:t xml:space="preserve">manage staff accounts</w:t>
+            </w:r>
+            <w:r>
+              <w:rPr>
+                <w:sz w:val="19"/>
+              </w:rPr>
+              <w:t xml:space="preserve"> </w:t>
+            </w:r>
+            <w:r>
+              <w:rPr>
+                <w:sz w:val="19"/>
+              </w:rPr>
+              <w:t xml:space="preserve">in the app and the web admin: add a staff or admin account with a starting password, change the name, phone and role, reset the password and disable / enable the account. A new role, a new password or disabling signs that person out at once. Nobody can change their own role or disable themselves, and the shop always keeps one active admin.</w:t>
+            </w:r>
+          </w:p>
+        </w:tc>
+        <w:tc>
+          <w:tcPr/>
+          <w:p>
+            <w:pPr>
+              <w:pStyle w:val="Compact"/>
+              <w:spacing w:after="40"/>
+              <w:jc w:val="left"/>
+            </w:pPr>
+            <w:r>
+              <w:rPr>
+                <w:sz w:val="19"/>
+              </w:rPr>
+              <w:t xml:space="preserve">S</w:t>
+            </w:r>
+          </w:p>
+        </w:tc>
+      </w:tr>
+      <w:tr>
+        <w:tc>
+          <w:tcPr>
+            <w:noWrap/>
+          </w:tcPr>
+          <w:p>
+            <w:pPr>
+              <w:pStyle w:val="Compact"/>
+              <w:spacing w:after="40"/>
+              <w:jc w:val="left"/>
+            </w:pPr>
+            <w:r>
+              <w:rPr>
+                <w:sz w:val="19"/>
+              </w:rPr>
+              <w:t xml:space="preserve">FR-AD11</w:t>
+            </w:r>
+          </w:p>
+        </w:tc>
+        <w:tc>
+          <w:tcPr/>
+          <w:p>
+            <w:pPr>
+              <w:pStyle w:val="Compact"/>
+              <w:spacing w:after="40"/>
+              <w:jc w:val="left"/>
+            </w:pPr>
+            <w:r>
+              <w:rPr>
+                <w:sz w:val="19"/>
+              </w:rPr>
+              <w:t xml:space="preserve">A</w:t>
+            </w:r>
+            <w:r>
+              <w:rPr>
+                <w:sz w:val="19"/>
+              </w:rPr>
+              <w:t xml:space="preserve"> </w:t>
+            </w:r>
+            <w:r>
+              <w:rPr>
+                <w:bCs/>
+                <w:b/>
+                <w:sz w:val="19"/>
+              </w:rPr>
+              <w:t xml:space="preserve">staff</w:t>
+            </w:r>
+            <w:r>
+              <w:rPr>
+                <w:sz w:val="19"/>
+              </w:rPr>
+              <w:t xml:space="preserve"> </w:t>
+            </w:r>
+            <w:r>
+              <w:rPr>
+                <w:sz w:val="19"/>
+              </w:rPr>
+              <w:t xml:space="preserve">account opens the same admin area but only sees what staff may do: dashboard, orders, products, categories, messages, reviews and customers (view only). Staff, Coupons and Block customer are hidden, and the API refuses them (403).</w:t>
+            </w:r>
+          </w:p>
+        </w:tc>
+        <w:tc>
+          <w:tcPr/>
+          <w:p>
+            <w:pPr>
+              <w:pStyle w:val="Compact"/>
+              <w:spacing w:after="40"/>
+              <w:jc w:val="left"/>
+            </w:pPr>
+            <w:r>
+              <w:rPr>
+                <w:sz w:val="19"/>
+              </w:rPr>
+              <w:t xml:space="preserve">S</w:t>
             </w:r>
           </w:p>
         </w:tc>
@@ -7208,7 +7416,13 @@
               <w:rPr>
                 <w:sz w:val="19"/>
               </w:rPr>
-              <w:t xml:space="preserve">; blocked users refused</w:t>
+              <w:t xml:space="preserve"> </w:t>
+            </w:r>
+            <w:r>
+              <w:rPr>
+                <w:sz w:val="19"/>
+              </w:rPr>
+              <w:t xml:space="preserve">(staff or admin; owner-only routes need admin); blocked users refused</w:t>
             </w:r>
           </w:p>
         </w:tc>
@@ -7534,7 +7748,32 @@
               <w:rPr>
                 <w:sz w:val="19"/>
               </w:rPr>
-              <w:t xml:space="preserve">list, details, block</w:t>
+              <w:t xml:space="preserve">list, details, block; staff accounts</w:t>
+            </w:r>
+            <w:r>
+              <w:rPr>
+                <w:sz w:val="19"/>
+              </w:rPr>
+              <w:t xml:space="preserve"> </w:t>
+            </w:r>
+            <w:r>
+              <w:rPr>
+                <w:rStyle w:val="VerbatimChar"/>
+                <w:sz w:val="19"/>
+              </w:rPr>
+              <w:t xml:space="preserve">/api/admin/staff</w:t>
+            </w:r>
+            <w:r>
+              <w:rPr>
+                <w:sz w:val="19"/>
+              </w:rPr>
+              <w:t xml:space="preserve"> </w:t>
+            </w:r>
+            <w:r>
+              <w:rPr>
+                <w:sz w:val="19"/>
+              </w:rPr>
+              <w:t xml:space="preserve">list, add, change, disable</w:t>
             </w:r>
           </w:p>
         </w:tc>
@@ -9173,7 +9412,7 @@
               <w:rPr>
                 <w:sz w:val="19"/>
               </w:rPr>
-              <w:t xml:space="preserve">Only logged-in users reach their own data; only admins reach admin data.</w:t>
+              <w:t xml:space="preserve">Only logged-in users reach their own data; only shop staff reach shop data, and only the owner manages staff.</w:t>
             </w:r>
           </w:p>
         </w:tc>
@@ -10328,6 +10567,42 @@
                 <w:sz w:val="19"/>
               </w:rPr>
               <w:t xml:space="preserve">A blocked customer cannot log in or use an existing token until an admin unblocks them.</w:t>
+            </w:r>
+          </w:p>
+        </w:tc>
+      </w:tr>
+      <w:tr>
+        <w:tc>
+          <w:tcPr>
+            <w:noWrap/>
+          </w:tcPr>
+          <w:p>
+            <w:pPr>
+              <w:pStyle w:val="Compact"/>
+              <w:spacing w:after="40"/>
+              <w:jc w:val="left"/>
+            </w:pPr>
+            <w:r>
+              <w:rPr>
+                <w:sz w:val="19"/>
+              </w:rPr>
+              <w:t xml:space="preserve">BR-11</w:t>
+            </w:r>
+          </w:p>
+        </w:tc>
+        <w:tc>
+          <w:tcPr/>
+          <w:p>
+            <w:pPr>
+              <w:pStyle w:val="Compact"/>
+              <w:spacing w:after="40"/>
+              <w:jc w:val="left"/>
+            </w:pPr>
+            <w:r>
+              <w:rPr>
+                <w:sz w:val="19"/>
+              </w:rPr>
+              <w:t xml:space="preserve">A disabled staff account cannot log in or use an existing token. Admins cannot change their own role or disable themselves, and the last active admin cannot be demoted or disabled.</w:t>
             </w:r>
           </w:p>
         </w:tc>
@@ -11159,13 +11434,13 @@
           <w:bCs/>
           <w:b/>
         </w:rPr>
-        <w:t xml:space="preserve">42</w:t>
+        <w:t xml:space="preserve">44</w:t>
       </w:r>
       <w:r>
         <w:t xml:space="preserve"> </w:t>
       </w:r>
       <w:r>
-        <w:t xml:space="preserve">(32 customer, 10 admin), plus sheets such as Filter, Rate a product and To review.</w:t>
+        <w:t xml:space="preserve">(32 customer, 12 admin), plus sheets such as Filter, Rate a product and To review.</w:t>
       </w:r>
     </w:p>
     <w:tbl>
@@ -13364,6 +13639,160 @@
                 <w:sz w:val="19"/>
               </w:rPr>
               <w:t xml:space="preserve">(bonus: reviews and ratings)</w:t>
+            </w:r>
+          </w:p>
+        </w:tc>
+      </w:tr>
+      <w:tr>
+        <w:tc>
+          <w:tcPr/>
+          <w:p>
+            <w:pPr>
+              <w:pStyle w:val="Compact"/>
+              <w:spacing w:after="40"/>
+            </w:pPr>
+          </w:p>
+        </w:tc>
+        <w:tc>
+          <w:tcPr/>
+          <w:p>
+            <w:pPr>
+              <w:pStyle w:val="Compact"/>
+              <w:spacing w:after="40"/>
+            </w:pPr>
+          </w:p>
+        </w:tc>
+        <w:tc>
+          <w:tcPr/>
+          <w:p>
+            <w:pPr>
+              <w:pStyle w:val="Compact"/>
+              <w:spacing w:after="40"/>
+            </w:pPr>
+          </w:p>
+        </w:tc>
+        <w:tc>
+          <w:tcPr/>
+          <w:p>
+            <w:pPr>
+              <w:pStyle w:val="Compact"/>
+              <w:spacing w:after="40"/>
+              <w:jc w:val="left"/>
+            </w:pPr>
+            <w:r>
+              <w:rPr>
+                <w:sz w:val="19"/>
+              </w:rPr>
+              <w:t xml:space="preserve">43</w:t>
+            </w:r>
+          </w:p>
+        </w:tc>
+        <w:tc>
+          <w:tcPr/>
+          <w:p>
+            <w:pPr>
+              <w:pStyle w:val="Compact"/>
+              <w:spacing w:after="40"/>
+              <w:jc w:val="left"/>
+            </w:pPr>
+            <w:r>
+              <w:rPr>
+                <w:sz w:val="19"/>
+              </w:rPr>
+              <w:t xml:space="preserve">Admin Staff</w:t>
+            </w:r>
+          </w:p>
+        </w:tc>
+        <w:tc>
+          <w:tcPr/>
+          <w:p>
+            <w:pPr>
+              <w:pStyle w:val="Compact"/>
+              <w:spacing w:after="40"/>
+              <w:jc w:val="left"/>
+            </w:pPr>
+            <w:r>
+              <w:rPr>
+                <w:sz w:val="19"/>
+              </w:rPr>
+              <w:t xml:space="preserve">(admin only)</w:t>
+            </w:r>
+          </w:p>
+        </w:tc>
+      </w:tr>
+      <w:tr>
+        <w:tc>
+          <w:tcPr/>
+          <w:p>
+            <w:pPr>
+              <w:pStyle w:val="Compact"/>
+              <w:spacing w:after="40"/>
+            </w:pPr>
+          </w:p>
+        </w:tc>
+        <w:tc>
+          <w:tcPr/>
+          <w:p>
+            <w:pPr>
+              <w:pStyle w:val="Compact"/>
+              <w:spacing w:after="40"/>
+            </w:pPr>
+          </w:p>
+        </w:tc>
+        <w:tc>
+          <w:tcPr/>
+          <w:p>
+            <w:pPr>
+              <w:pStyle w:val="Compact"/>
+              <w:spacing w:after="40"/>
+            </w:pPr>
+          </w:p>
+        </w:tc>
+        <w:tc>
+          <w:tcPr/>
+          <w:p>
+            <w:pPr>
+              <w:pStyle w:val="Compact"/>
+              <w:spacing w:after="40"/>
+              <w:jc w:val="left"/>
+            </w:pPr>
+            <w:r>
+              <w:rPr>
+                <w:sz w:val="19"/>
+              </w:rPr>
+              <w:t xml:space="preserve">44</w:t>
+            </w:r>
+          </w:p>
+        </w:tc>
+        <w:tc>
+          <w:tcPr/>
+          <w:p>
+            <w:pPr>
+              <w:pStyle w:val="Compact"/>
+              <w:spacing w:after="40"/>
+              <w:jc w:val="left"/>
+            </w:pPr>
+            <w:r>
+              <w:rPr>
+                <w:sz w:val="19"/>
+              </w:rPr>
+              <w:t xml:space="preserve">Add / Edit Staff Member</w:t>
+            </w:r>
+          </w:p>
+        </w:tc>
+        <w:tc>
+          <w:tcPr/>
+          <w:p>
+            <w:pPr>
+              <w:pStyle w:val="Compact"/>
+              <w:spacing w:after="40"/>
+              <w:jc w:val="left"/>
+            </w:pPr>
+            <w:r>
+              <w:rPr>
+                <w:sz w:val="19"/>
+              </w:rPr>
+              <w:t xml:space="preserve">(admin only)</w:t>
             </w:r>
           </w:p>
         </w:tc>

</xml_diff>

<commit_message>
chore: keep docs/screenshots on the store-info branch only
README and REQUIREMENTS (md, docx, pdf) now point to the store-info branch.

Co-Authored-By: Claude Opus 5.5 <noreply@anthropic.com>
Claude-Session: https://claude.ai/code/session_01NZHPyp1BcAyBymo1vC6nPu
</commit_message>
<xml_diff>
--- a/docs/requirements/REQUIREMENTS.docx
+++ b/docs/requirements/REQUIREMENTS.docx
@@ -2,7 +2,7 @@
 <file path=word/document.xml><?xml version="1.0" encoding="utf-8"?>
 <w:document xmlns:w="http://schemas.openxmlformats.org/wordprocessingml/2006/main" xmlns:m="http://schemas.openxmlformats.org/officeDocument/2006/math" xmlns:r="http://schemas.openxmlformats.org/officeDocument/2006/relationships" xmlns:o="urn:schemas-microsoft-com:office:office" xmlns:v="urn:schemas-microsoft-com:vml" xmlns:w10="urn:schemas-microsoft-com:office:word" xmlns:a="http://schemas.openxmlformats.org/drawingml/2006/main" xmlns:pic="http://schemas.openxmlformats.org/drawingml/2006/picture" xmlns:wp="http://schemas.openxmlformats.org/drawingml/2006/wordprocessingDrawing">
   <w:body>
-    <w:bookmarkStart w:id="51" w:name="requirement-analysis---anime-world-shop"/>
+    <w:bookmarkStart w:id="50" w:name="requirement-analysis---anime-world-shop"/>
     <w:p>
       <w:pPr>
         <w:pStyle w:val="Heading1"/>
@@ -11409,7 +11409,7 @@
       </w:r>
     </w:p>
     <w:bookmarkEnd w:id="46"/>
-    <w:bookmarkStart w:id="48" w:name="X4bbdd3ef56a91f74e0cae1fe8bc86d41ded6f62"/>
+    <w:bookmarkStart w:id="47" w:name="X4bbdd3ef56a91f74e0cae1fe8bc86d41ded6f62"/>
     <w:p>
       <w:pPr>
         <w:pStyle w:val="Heading2"/>
@@ -13808,16 +13808,32 @@
       <w:r>
         <w:t xml:space="preserve"> </w:t>
       </w:r>
-      <w:hyperlink r:id="rId47">
-        <w:r>
-          <w:rPr>
-            <w:rStyle w:val="VerbatimChar"/>
-          </w:rPr>
-          <w:t xml:space="preserve">docs/screenshots/</w:t>
-        </w:r>
-      </w:hyperlink>
       <w:r>
-        <w:t xml:space="preserve">.</w:t>
+        <w:rPr>
+          <w:rStyle w:val="VerbatimChar"/>
+        </w:rPr>
+        <w:t xml:space="preserve">docs/screenshots/</w:t>
+      </w:r>
+      <w:r>
+        <w:t xml:space="preserve"> </w:t>
+      </w:r>
+      <w:r>
+        <w:t xml:space="preserve">on the</w:t>
+      </w:r>
+      <w:r>
+        <w:t xml:space="preserve"> </w:t>
+      </w:r>
+      <w:r>
+        <w:rPr>
+          <w:rStyle w:val="VerbatimChar"/>
+        </w:rPr>
+        <w:t xml:space="preserve">store-info</w:t>
+      </w:r>
+      <w:r>
+        <w:t xml:space="preserve"> </w:t>
+      </w:r>
+      <w:r>
+        <w:t xml:space="preserve">branch of the repository.</w:t>
       </w:r>
     </w:p>
     <w:p>
@@ -13827,8 +13843,8 @@
         </w:pict>
       </w:r>
     </w:p>
-    <w:bookmarkEnd w:id="48"/>
-    <w:bookmarkStart w:id="49" w:name="X4210f28d308f0fe73919f5d1cd7052ee93de2f7"/>
+    <w:bookmarkEnd w:id="47"/>
+    <w:bookmarkStart w:id="48" w:name="X4210f28d308f0fe73919f5d1cd7052ee93de2f7"/>
     <w:p>
       <w:pPr>
         <w:pStyle w:val="Heading2"/>
@@ -17190,8 +17206,8 @@
         </w:pict>
       </w:r>
     </w:p>
-    <w:bookmarkEnd w:id="49"/>
-    <w:bookmarkStart w:id="50" w:name="X62906ee64d49b227cac039934b1c94cd1c357d6"/>
+    <w:bookmarkEnd w:id="48"/>
+    <w:bookmarkStart w:id="49" w:name="X62906ee64d49b227cac039934b1c94cd1c357d6"/>
     <w:p>
       <w:pPr>
         <w:pStyle w:val="Heading2"/>
@@ -17415,8 +17431,8 @@
         <w:t xml:space="preserve">Khmer translation of the admin tools; push notifications (Firebase); deployment to a cloud server.</w:t>
       </w:r>
     </w:p>
+    <w:bookmarkEnd w:id="49"/>
     <w:bookmarkEnd w:id="50"/>
-    <w:bookmarkEnd w:id="51"/>
     <w:sectPr>
       <w:pgMar w:left="1440" w:right="1440" w:top="1296" w:bottom="1296"/>
     </w:sectPr>

</xml_diff>